<commit_message>
Add remaining Week 8 files and clean up temporary files
</commit_message>
<xml_diff>
--- a/document upto week 7 (2).docx
+++ b/document upto week 7 (2).docx
@@ -521,7 +521,6 @@
             <w:rPr>
               <w:rFonts w:eastAsiaTheme="minorEastAsia"/>
               <w:noProof/>
-              <w:lang/>
             </w:rPr>
           </w:pPr>
           <w:r>
@@ -600,7 +599,6 @@
             <w:rPr>
               <w:rFonts w:eastAsiaTheme="minorEastAsia"/>
               <w:noProof/>
-              <w:lang/>
             </w:rPr>
           </w:pPr>
           <w:hyperlink w:anchor="_Toc232334683" w:history="1">
@@ -671,7 +669,6 @@
             <w:rPr>
               <w:rFonts w:eastAsiaTheme="minorEastAsia"/>
               <w:noProof/>
-              <w:lang/>
             </w:rPr>
           </w:pPr>
           <w:hyperlink w:anchor="_Toc232334684" w:history="1">
@@ -741,7 +738,6 @@
             <w:rPr>
               <w:rFonts w:eastAsiaTheme="minorEastAsia"/>
               <w:noProof/>
-              <w:lang/>
             </w:rPr>
           </w:pPr>
           <w:hyperlink w:anchor="_Toc232334685" w:history="1">
@@ -812,7 +808,6 @@
             <w:rPr>
               <w:rFonts w:eastAsiaTheme="minorEastAsia"/>
               <w:noProof/>
-              <w:lang/>
             </w:rPr>
           </w:pPr>
           <w:hyperlink w:anchor="_Toc232334686" w:history="1">
@@ -883,7 +878,6 @@
             <w:rPr>
               <w:rFonts w:eastAsiaTheme="minorEastAsia"/>
               <w:noProof/>
-              <w:lang/>
             </w:rPr>
           </w:pPr>
           <w:hyperlink w:anchor="_Toc232334687" w:history="1">
@@ -954,7 +948,6 @@
             <w:rPr>
               <w:rFonts w:eastAsiaTheme="minorEastAsia"/>
               <w:noProof/>
-              <w:lang/>
             </w:rPr>
           </w:pPr>
           <w:hyperlink w:anchor="_Toc232334688" w:history="1">
@@ -1024,7 +1017,6 @@
             <w:rPr>
               <w:rFonts w:eastAsiaTheme="minorEastAsia"/>
               <w:noProof/>
-              <w:lang/>
             </w:rPr>
           </w:pPr>
           <w:hyperlink w:anchor="_Toc232334689" w:history="1">
@@ -1095,7 +1087,6 @@
             <w:rPr>
               <w:rFonts w:eastAsiaTheme="minorEastAsia"/>
               <w:noProof/>
-              <w:lang/>
             </w:rPr>
           </w:pPr>
           <w:hyperlink w:anchor="_Toc232334690" w:history="1">
@@ -1166,7 +1157,6 @@
             <w:rPr>
               <w:rFonts w:eastAsiaTheme="minorEastAsia"/>
               <w:noProof/>
-              <w:lang/>
             </w:rPr>
           </w:pPr>
           <w:hyperlink w:anchor="_Toc232334691" w:history="1">
@@ -1237,7 +1227,6 @@
             <w:rPr>
               <w:rFonts w:eastAsiaTheme="minorEastAsia"/>
               <w:noProof/>
-              <w:lang/>
             </w:rPr>
           </w:pPr>
           <w:hyperlink w:anchor="_Toc232334692" w:history="1">
@@ -1308,7 +1297,6 @@
             <w:rPr>
               <w:rFonts w:eastAsiaTheme="minorEastAsia"/>
               <w:noProof/>
-              <w:lang/>
             </w:rPr>
           </w:pPr>
           <w:hyperlink w:anchor="_Toc232334693" w:history="1">
@@ -1379,7 +1367,6 @@
             <w:rPr>
               <w:rFonts w:eastAsiaTheme="minorEastAsia"/>
               <w:noProof/>
-              <w:lang/>
             </w:rPr>
           </w:pPr>
           <w:hyperlink w:anchor="_Toc232334694" w:history="1">
@@ -1450,7 +1437,6 @@
             <w:rPr>
               <w:rFonts w:eastAsiaTheme="minorEastAsia"/>
               <w:noProof/>
-              <w:lang/>
             </w:rPr>
           </w:pPr>
           <w:hyperlink w:anchor="_Toc232334695" w:history="1">
@@ -1520,7 +1506,6 @@
             <w:rPr>
               <w:rFonts w:eastAsiaTheme="minorEastAsia"/>
               <w:noProof/>
-              <w:lang/>
             </w:rPr>
           </w:pPr>
           <w:hyperlink w:anchor="_Toc232334696" w:history="1">
@@ -1591,7 +1576,6 @@
             <w:rPr>
               <w:rFonts w:eastAsiaTheme="minorEastAsia"/>
               <w:noProof/>
-              <w:lang/>
             </w:rPr>
           </w:pPr>
           <w:hyperlink w:anchor="_Toc232334697" w:history="1">
@@ -1662,7 +1646,6 @@
             <w:rPr>
               <w:rFonts w:eastAsiaTheme="minorEastAsia"/>
               <w:noProof/>
-              <w:lang/>
             </w:rPr>
           </w:pPr>
           <w:hyperlink w:anchor="_Toc232334698" w:history="1">
@@ -1733,7 +1716,6 @@
             <w:rPr>
               <w:rFonts w:eastAsiaTheme="minorEastAsia"/>
               <w:noProof/>
-              <w:lang/>
             </w:rPr>
           </w:pPr>
           <w:hyperlink w:anchor="_Toc232334699" w:history="1">
@@ -1804,7 +1786,6 @@
             <w:rPr>
               <w:rFonts w:eastAsiaTheme="minorEastAsia"/>
               <w:noProof/>
-              <w:lang/>
             </w:rPr>
           </w:pPr>
           <w:hyperlink w:anchor="_Toc232334700" w:history="1">
@@ -1875,7 +1856,6 @@
             <w:rPr>
               <w:rFonts w:eastAsiaTheme="minorEastAsia"/>
               <w:noProof/>
-              <w:lang/>
             </w:rPr>
           </w:pPr>
           <w:hyperlink w:anchor="_Toc232334701" w:history="1">
@@ -1946,7 +1926,6 @@
             <w:rPr>
               <w:rFonts w:eastAsiaTheme="minorEastAsia"/>
               <w:noProof/>
-              <w:lang/>
             </w:rPr>
           </w:pPr>
           <w:hyperlink w:anchor="_Toc232334702" w:history="1">
@@ -2016,7 +1995,6 @@
             <w:rPr>
               <w:rFonts w:eastAsiaTheme="minorEastAsia"/>
               <w:noProof/>
-              <w:lang/>
             </w:rPr>
           </w:pPr>
           <w:hyperlink w:anchor="_Toc232334703" w:history="1">
@@ -2086,7 +2064,6 @@
             <w:rPr>
               <w:rFonts w:eastAsiaTheme="minorEastAsia"/>
               <w:noProof/>
-              <w:lang/>
             </w:rPr>
           </w:pPr>
           <w:hyperlink w:anchor="_Toc232334704" w:history="1">
@@ -2156,7 +2133,6 @@
             <w:rPr>
               <w:rFonts w:eastAsiaTheme="minorEastAsia"/>
               <w:noProof/>
-              <w:lang/>
             </w:rPr>
           </w:pPr>
           <w:hyperlink w:anchor="_Toc232334705" w:history="1">
@@ -2227,7 +2203,6 @@
             <w:rPr>
               <w:rFonts w:eastAsiaTheme="minorEastAsia"/>
               <w:noProof/>
-              <w:lang/>
             </w:rPr>
           </w:pPr>
           <w:hyperlink w:anchor="_Toc232334706" w:history="1">
@@ -2298,7 +2273,6 @@
             <w:rPr>
               <w:rFonts w:eastAsiaTheme="minorEastAsia"/>
               <w:noProof/>
-              <w:lang/>
             </w:rPr>
           </w:pPr>
           <w:hyperlink w:anchor="_Toc232334707" w:history="1">
@@ -2369,7 +2343,6 @@
             <w:rPr>
               <w:rFonts w:eastAsiaTheme="minorEastAsia"/>
               <w:noProof/>
-              <w:lang/>
             </w:rPr>
           </w:pPr>
           <w:hyperlink w:anchor="_Toc232334708" w:history="1">
@@ -2440,7 +2413,6 @@
             <w:rPr>
               <w:rFonts w:eastAsiaTheme="minorEastAsia"/>
               <w:noProof/>
-              <w:lang/>
             </w:rPr>
           </w:pPr>
           <w:hyperlink w:anchor="_Toc232334709" w:history="1">
@@ -2511,7 +2483,6 @@
             <w:rPr>
               <w:rFonts w:eastAsiaTheme="minorEastAsia"/>
               <w:noProof/>
-              <w:lang/>
             </w:rPr>
           </w:pPr>
           <w:hyperlink w:anchor="_Toc232334710" w:history="1">
@@ -2582,7 +2553,6 @@
             <w:rPr>
               <w:rFonts w:eastAsiaTheme="minorEastAsia"/>
               <w:noProof/>
-              <w:lang/>
             </w:rPr>
           </w:pPr>
           <w:hyperlink w:anchor="_Toc232334711" w:history="1">
@@ -2653,7 +2623,6 @@
             <w:rPr>
               <w:rFonts w:eastAsiaTheme="minorEastAsia"/>
               <w:noProof/>
-              <w:lang/>
             </w:rPr>
           </w:pPr>
           <w:hyperlink w:anchor="_Toc232334712" w:history="1">
@@ -2724,7 +2693,6 @@
             <w:rPr>
               <w:rFonts w:eastAsiaTheme="minorEastAsia"/>
               <w:noProof/>
-              <w:lang/>
             </w:rPr>
           </w:pPr>
           <w:hyperlink w:anchor="_Toc232334713" w:history="1">
@@ -2795,7 +2763,6 @@
             <w:rPr>
               <w:rFonts w:eastAsiaTheme="minorEastAsia"/>
               <w:noProof/>
-              <w:lang/>
             </w:rPr>
           </w:pPr>
           <w:hyperlink w:anchor="_Toc232334714" w:history="1">
@@ -2866,7 +2833,6 @@
             <w:rPr>
               <w:rFonts w:eastAsiaTheme="minorEastAsia"/>
               <w:noProof/>
-              <w:lang/>
             </w:rPr>
           </w:pPr>
           <w:hyperlink w:anchor="_Toc232334715" w:history="1">
@@ -2937,7 +2903,6 @@
             <w:rPr>
               <w:rFonts w:eastAsiaTheme="minorEastAsia"/>
               <w:noProof/>
-              <w:lang/>
             </w:rPr>
           </w:pPr>
           <w:hyperlink w:anchor="_Toc232334716" w:history="1">
@@ -3008,7 +2973,6 @@
             <w:rPr>
               <w:rFonts w:eastAsiaTheme="minorEastAsia"/>
               <w:noProof/>
-              <w:lang/>
             </w:rPr>
           </w:pPr>
           <w:hyperlink w:anchor="_Toc232334717" w:history="1">
@@ -3079,7 +3043,6 @@
             <w:rPr>
               <w:rFonts w:eastAsiaTheme="minorEastAsia"/>
               <w:noProof/>
-              <w:lang/>
             </w:rPr>
           </w:pPr>
           <w:hyperlink w:anchor="_Toc232334718" w:history="1">
@@ -3150,7 +3113,6 @@
             <w:rPr>
               <w:rFonts w:eastAsiaTheme="minorEastAsia"/>
               <w:noProof/>
-              <w:lang/>
             </w:rPr>
           </w:pPr>
           <w:hyperlink w:anchor="_Toc232334719" w:history="1">
@@ -3221,7 +3183,6 @@
             <w:rPr>
               <w:rFonts w:eastAsiaTheme="minorEastAsia"/>
               <w:noProof/>
-              <w:lang/>
             </w:rPr>
           </w:pPr>
           <w:hyperlink w:anchor="_Toc232334720" w:history="1">
@@ -3292,7 +3253,6 @@
             <w:rPr>
               <w:rFonts w:eastAsiaTheme="minorEastAsia"/>
               <w:noProof/>
-              <w:lang/>
             </w:rPr>
           </w:pPr>
           <w:hyperlink w:anchor="_Toc232334721" w:history="1">
@@ -3363,7 +3323,6 @@
             <w:rPr>
               <w:rFonts w:eastAsiaTheme="minorEastAsia"/>
               <w:noProof/>
-              <w:lang/>
             </w:rPr>
           </w:pPr>
           <w:hyperlink w:anchor="_Toc232334722" w:history="1">
@@ -3434,7 +3393,6 @@
             <w:rPr>
               <w:rFonts w:eastAsiaTheme="minorEastAsia"/>
               <w:noProof/>
-              <w:lang/>
             </w:rPr>
           </w:pPr>
           <w:hyperlink w:anchor="_Toc232334723" w:history="1">
@@ -3505,7 +3463,6 @@
             <w:rPr>
               <w:rFonts w:eastAsiaTheme="minorEastAsia"/>
               <w:noProof/>
-              <w:lang/>
             </w:rPr>
           </w:pPr>
           <w:hyperlink w:anchor="_Toc232334724" w:history="1">
@@ -3576,7 +3533,6 @@
             <w:rPr>
               <w:rFonts w:eastAsiaTheme="minorEastAsia"/>
               <w:noProof/>
-              <w:lang/>
             </w:rPr>
           </w:pPr>
           <w:hyperlink w:anchor="_Toc232334725" w:history="1">
@@ -3647,7 +3603,6 @@
             <w:rPr>
               <w:rFonts w:eastAsiaTheme="minorEastAsia"/>
               <w:noProof/>
-              <w:lang/>
             </w:rPr>
           </w:pPr>
           <w:hyperlink w:anchor="_Toc232334726" w:history="1">
@@ -3718,7 +3673,6 @@
             <w:rPr>
               <w:rFonts w:eastAsiaTheme="minorEastAsia"/>
               <w:noProof/>
-              <w:lang/>
             </w:rPr>
           </w:pPr>
           <w:hyperlink w:anchor="_Toc232334727" w:history="1">
@@ -3789,7 +3743,6 @@
             <w:rPr>
               <w:rFonts w:eastAsiaTheme="minorEastAsia"/>
               <w:noProof/>
-              <w:lang/>
             </w:rPr>
           </w:pPr>
           <w:hyperlink w:anchor="_Toc232334728" w:history="1">
@@ -3860,7 +3813,6 @@
             <w:rPr>
               <w:rFonts w:eastAsiaTheme="minorEastAsia"/>
               <w:noProof/>
-              <w:lang/>
             </w:rPr>
           </w:pPr>
           <w:hyperlink w:anchor="_Toc232334729" w:history="1">
@@ -3931,7 +3883,6 @@
             <w:rPr>
               <w:rFonts w:eastAsiaTheme="minorEastAsia"/>
               <w:noProof/>
-              <w:lang/>
             </w:rPr>
           </w:pPr>
           <w:hyperlink w:anchor="_Toc232334730" w:history="1">
@@ -4002,7 +3953,6 @@
             <w:rPr>
               <w:rFonts w:eastAsiaTheme="minorEastAsia"/>
               <w:noProof/>
-              <w:lang/>
             </w:rPr>
           </w:pPr>
           <w:hyperlink w:anchor="_Toc232334731" w:history="1">
@@ -4089,7 +4039,6 @@
             <w:rPr>
               <w:rFonts w:eastAsiaTheme="minorEastAsia"/>
               <w:noProof/>
-              <w:lang/>
             </w:rPr>
           </w:pPr>
           <w:hyperlink w:anchor="_Toc232334732" w:history="1">
@@ -4160,7 +4109,6 @@
             <w:rPr>
               <w:rFonts w:eastAsiaTheme="minorEastAsia"/>
               <w:noProof/>
-              <w:lang/>
             </w:rPr>
           </w:pPr>
           <w:hyperlink w:anchor="_Toc232334733" w:history="1">
@@ -8987,8 +8935,1660 @@
           <w:sz w:val="24"/>
           <w:szCs w:val="24"/>
         </w:rPr>
-        <w:t>encrypted email.</w:t>
-      </w:r>
+        <w:t>encrypted email</w:t>
+      </w:r>
+      <w:r>
+        <w:rPr>
+          <w:rFonts w:ascii="Times New Roman" w:hAnsi="Times New Roman" w:cs="Times New Roman"/>
+          <w:sz w:val="24"/>
+          <w:szCs w:val="24"/>
+        </w:rPr>
+        <w:t>.</w:t>
+      </w:r>
+    </w:p>
+    <w:p>
+      <w:pPr>
+        <w:rPr>
+          <w:rFonts w:ascii="Times New Roman" w:hAnsi="Times New Roman" w:cs="Times New Roman"/>
+          <w:sz w:val="24"/>
+          <w:szCs w:val="24"/>
+        </w:rPr>
+      </w:pPr>
+    </w:p>
+    <w:p>
+      <w:pPr>
+        <w:rPr>
+          <w:rFonts w:ascii="Times New Roman" w:hAnsi="Times New Roman" w:cs="Times New Roman"/>
+          <w:sz w:val="24"/>
+          <w:szCs w:val="24"/>
+        </w:rPr>
+      </w:pPr>
+    </w:p>
+    <w:p>
+      <w:pPr>
+        <w:rPr>
+          <w:rFonts w:ascii="Times New Roman" w:hAnsi="Times New Roman" w:cs="Times New Roman"/>
+          <w:sz w:val="24"/>
+          <w:szCs w:val="24"/>
+        </w:rPr>
+      </w:pPr>
+    </w:p>
+    <w:p>
+      <w:pPr>
+        <w:rPr>
+          <w:rFonts w:ascii="Times New Roman" w:hAnsi="Times New Roman" w:cs="Times New Roman"/>
+          <w:b/>
+          <w:bCs/>
+          <w:sz w:val="32"/>
+          <w:szCs w:val="32"/>
+        </w:rPr>
+      </w:pPr>
+      <w:r>
+        <w:rPr>
+          <w:rFonts w:ascii="Times New Roman" w:hAnsi="Times New Roman" w:cs="Times New Roman"/>
+          <w:b/>
+          <w:bCs/>
+          <w:sz w:val="32"/>
+          <w:szCs w:val="32"/>
+        </w:rPr>
+        <w:lastRenderedPageBreak/>
+        <w:t>Week 8: Secure Communication Protocols</w:t>
+      </w:r>
+    </w:p>
+    <w:p>
+      <w:pPr>
+        <w:spacing w:before="100" w:beforeAutospacing="1" w:after="100" w:afterAutospacing="1" w:line="240" w:lineRule="auto"/>
+        <w:rPr>
+          <w:rFonts w:ascii="Times New Roman" w:eastAsia="Times New Roman" w:hAnsi="Times New Roman" w:cs="Times New Roman"/>
+          <w:sz w:val="24"/>
+          <w:szCs w:val="24"/>
+        </w:rPr>
+      </w:pPr>
+      <w:r>
+        <w:rPr>
+          <w:rFonts w:ascii="Times New Roman" w:eastAsia="Times New Roman" w:hAnsi="Times New Roman" w:cs="Times New Roman"/>
+          <w:sz w:val="24"/>
+          <w:szCs w:val="24"/>
+        </w:rPr>
+        <w:t>Implementation and Analysis of Secure Communication Systems</w:t>
+      </w:r>
+    </w:p>
+    <w:p>
+      <w:pPr>
+        <w:spacing w:before="100" w:beforeAutospacing="1" w:after="100" w:afterAutospacing="1" w:line="240" w:lineRule="auto"/>
+        <w:outlineLvl w:val="2"/>
+        <w:rPr>
+          <w:rFonts w:ascii="Times New Roman" w:eastAsia="Times New Roman" w:hAnsi="Times New Roman" w:cs="Times New Roman"/>
+          <w:b/>
+          <w:bCs/>
+          <w:sz w:val="27"/>
+          <w:szCs w:val="27"/>
+        </w:rPr>
+      </w:pPr>
+      <w:r>
+        <w:rPr>
+          <w:rFonts w:ascii="Times New Roman" w:eastAsia="Times New Roman" w:hAnsi="Times New Roman" w:cs="Times New Roman"/>
+          <w:b/>
+          <w:bCs/>
+          <w:sz w:val="27"/>
+          <w:szCs w:val="27"/>
+        </w:rPr>
+        <w:t>Fig 1: SSL/TLS Configuration</w:t>
+      </w:r>
+    </w:p>
+    <w:p>
+      <w:pPr>
+        <w:spacing w:before="100" w:beforeAutospacing="1" w:after="100" w:afterAutospacing="1" w:line="240" w:lineRule="auto"/>
+        <w:outlineLvl w:val="2"/>
+        <w:rPr>
+          <w:rFonts w:ascii="Times New Roman" w:hAnsi="Times New Roman" w:cs="Times New Roman"/>
+          <w:sz w:val="24"/>
+          <w:szCs w:val="24"/>
+        </w:rPr>
+      </w:pPr>
+      <w:r>
+        <w:rPr>
+          <w:rFonts w:ascii="Times New Roman" w:hAnsi="Times New Roman" w:cs="Times New Roman"/>
+          <w:sz w:val="24"/>
+          <w:szCs w:val="24"/>
+        </w:rPr>
+        <w:t>The SSL/TLS configuration is for TLS 1.2 protocol with ECDHE key exchange, and uses RSA-2048 authentication and AES-256-GCM encryption. A self-signed certificate was generated for the server authentication. There are a number of security features, such as PFS, cryptography suites, and MITM prevention.</w:t>
+      </w:r>
+    </w:p>
+    <w:p>
+      <w:pPr>
+        <w:spacing w:before="100" w:beforeAutospacing="1" w:after="100" w:afterAutospacing="1" w:line="240" w:lineRule="auto"/>
+        <w:outlineLvl w:val="2"/>
+        <w:rPr>
+          <w:rFonts w:ascii="Times New Roman" w:eastAsia="Times New Roman" w:hAnsi="Times New Roman" w:cs="Times New Roman"/>
+          <w:b/>
+          <w:bCs/>
+          <w:sz w:val="27"/>
+          <w:szCs w:val="27"/>
+        </w:rPr>
+      </w:pPr>
+      <w:r>
+        <w:rPr>
+          <w:rFonts w:ascii="Times New Roman" w:eastAsia="Times New Roman" w:hAnsi="Times New Roman" w:cs="Times New Roman"/>
+          <w:b/>
+          <w:bCs/>
+          <w:sz w:val="27"/>
+          <w:szCs w:val="27"/>
+        </w:rPr>
+        <w:drawing>
+          <wp:inline distT="0" distB="0" distL="0" distR="0" wp14:anchorId="5C90665B" wp14:editId="5033041A">
+            <wp:extent cx="5943600" cy="4228465"/>
+            <wp:effectExtent l="0" t="0" r="0" b="635"/>
+            <wp:docPr id="46" name="Picture 46"/>
+            <wp:cNvGraphicFramePr>
+              <a:graphicFrameLocks xmlns:a="http://schemas.openxmlformats.org/drawingml/2006/main" noChangeAspect="1"/>
+            </wp:cNvGraphicFramePr>
+            <a:graphic xmlns:a="http://schemas.openxmlformats.org/drawingml/2006/main">
+              <a:graphicData uri="http://schemas.openxmlformats.org/drawingml/2006/picture">
+                <pic:pic xmlns:pic="http://schemas.openxmlformats.org/drawingml/2006/picture">
+                  <pic:nvPicPr>
+                    <pic:cNvPr id="1" name=""/>
+                    <pic:cNvPicPr/>
+                  </pic:nvPicPr>
+                  <pic:blipFill>
+                    <a:blip r:embed="rId67"/>
+                    <a:stretch>
+                      <a:fillRect/>
+                    </a:stretch>
+                  </pic:blipFill>
+                  <pic:spPr>
+                    <a:xfrm>
+                      <a:off x="0" y="0"/>
+                      <a:ext cx="5943600" cy="4228465"/>
+                    </a:xfrm>
+                    <a:prstGeom prst="rect">
+                      <a:avLst/>
+                    </a:prstGeom>
+                  </pic:spPr>
+                </pic:pic>
+              </a:graphicData>
+            </a:graphic>
+          </wp:inline>
+        </w:drawing>
+      </w:r>
+    </w:p>
+    <w:p>
+      <w:pPr>
+        <w:spacing w:before="100" w:beforeAutospacing="1" w:after="100" w:afterAutospacing="1" w:line="240" w:lineRule="auto"/>
+        <w:outlineLvl w:val="2"/>
+        <w:rPr>
+          <w:rFonts w:ascii="Times New Roman" w:eastAsia="Times New Roman" w:hAnsi="Times New Roman" w:cs="Times New Roman"/>
+          <w:b/>
+          <w:bCs/>
+          <w:sz w:val="27"/>
+          <w:szCs w:val="27"/>
+        </w:rPr>
+      </w:pPr>
+      <w:r>
+        <w:rPr>
+          <w:rFonts w:ascii="Times New Roman" w:eastAsia="Times New Roman" w:hAnsi="Times New Roman" w:cs="Times New Roman"/>
+          <w:b/>
+          <w:bCs/>
+          <w:sz w:val="27"/>
+          <w:szCs w:val="27"/>
+        </w:rPr>
+        <w:lastRenderedPageBreak/>
+        <w:drawing>
+          <wp:inline distT="0" distB="0" distL="0" distR="0" wp14:anchorId="3C27A73F" wp14:editId="5847F4D3">
+            <wp:extent cx="5706271" cy="2219635"/>
+            <wp:effectExtent l="0" t="0" r="0" b="9525"/>
+            <wp:docPr id="61" name="Picture 61"/>
+            <wp:cNvGraphicFramePr>
+              <a:graphicFrameLocks xmlns:a="http://schemas.openxmlformats.org/drawingml/2006/main" noChangeAspect="1"/>
+            </wp:cNvGraphicFramePr>
+            <a:graphic xmlns:a="http://schemas.openxmlformats.org/drawingml/2006/main">
+              <a:graphicData uri="http://schemas.openxmlformats.org/drawingml/2006/picture">
+                <pic:pic xmlns:pic="http://schemas.openxmlformats.org/drawingml/2006/picture">
+                  <pic:nvPicPr>
+                    <pic:cNvPr id="1" name=""/>
+                    <pic:cNvPicPr/>
+                  </pic:nvPicPr>
+                  <pic:blipFill>
+                    <a:blip r:embed="rId68"/>
+                    <a:stretch>
+                      <a:fillRect/>
+                    </a:stretch>
+                  </pic:blipFill>
+                  <pic:spPr>
+                    <a:xfrm>
+                      <a:off x="0" y="0"/>
+                      <a:ext cx="5706271" cy="2219635"/>
+                    </a:xfrm>
+                    <a:prstGeom prst="rect">
+                      <a:avLst/>
+                    </a:prstGeom>
+                  </pic:spPr>
+                </pic:pic>
+              </a:graphicData>
+            </a:graphic>
+          </wp:inline>
+        </w:drawing>
+      </w:r>
+    </w:p>
+    <w:p>
+      <w:pPr>
+        <w:spacing w:before="100" w:beforeAutospacing="1" w:after="100" w:afterAutospacing="1" w:line="240" w:lineRule="auto"/>
+        <w:outlineLvl w:val="2"/>
+        <w:rPr>
+          <w:rFonts w:ascii="Times New Roman" w:eastAsia="Times New Roman" w:hAnsi="Times New Roman" w:cs="Times New Roman"/>
+          <w:b/>
+          <w:bCs/>
+          <w:sz w:val="27"/>
+          <w:szCs w:val="27"/>
+        </w:rPr>
+      </w:pPr>
+      <w:r>
+        <w:rPr>
+          <w:rFonts w:ascii="Times New Roman" w:eastAsia="Times New Roman" w:hAnsi="Times New Roman" w:cs="Times New Roman"/>
+          <w:b/>
+          <w:bCs/>
+          <w:sz w:val="27"/>
+          <w:szCs w:val="27"/>
+        </w:rPr>
+        <w:t>Fig 2: Secure HTTPS Communication Test</w:t>
+      </w:r>
+    </w:p>
+    <w:p>
+      <w:pPr>
+        <w:spacing w:before="100" w:beforeAutospacing="1" w:after="100" w:afterAutospacing="1" w:line="240" w:lineRule="auto"/>
+        <w:outlineLvl w:val="2"/>
+        <w:rPr>
+          <w:rFonts w:ascii="Times New Roman" w:eastAsia="Times New Roman" w:hAnsi="Times New Roman" w:cs="Times New Roman"/>
+          <w:sz w:val="24"/>
+          <w:szCs w:val="24"/>
+        </w:rPr>
+      </w:pPr>
+      <w:r>
+        <w:rPr>
+          <w:rFonts w:ascii="Times New Roman" w:eastAsia="Times New Roman" w:hAnsi="Times New Roman" w:cs="Times New Roman"/>
+          <w:sz w:val="24"/>
+          <w:szCs w:val="24"/>
+        </w:rPr>
+        <w:t xml:space="preserve">The steps of HTTPS communication with TLS handshake are shown </w:t>
+      </w:r>
+      <w:r>
+        <w:rPr>
+          <w:rFonts w:ascii="Times New Roman" w:eastAsia="Times New Roman" w:hAnsi="Times New Roman" w:cs="Times New Roman"/>
+          <w:sz w:val="24"/>
+          <w:szCs w:val="24"/>
+        </w:rPr>
+        <w:t>here</w:t>
+      </w:r>
+      <w:r>
+        <w:rPr>
+          <w:rFonts w:ascii="Times New Roman" w:eastAsia="Times New Roman" w:hAnsi="Times New Roman" w:cs="Times New Roman"/>
+          <w:sz w:val="24"/>
+          <w:szCs w:val="24"/>
+        </w:rPr>
+        <w:t>. In the case of comparison, HTTP sends data over the network in plain text, which is susceptible to eavesdropping; with HTTPS, all data is encrypted with AES-256 and data sent over the network can only be read by the server if you've negotiated this, which is good for data security and provides server authentication.</w:t>
+      </w:r>
+    </w:p>
+    <w:p>
+      <w:pPr>
+        <w:spacing w:before="100" w:beforeAutospacing="1" w:after="100" w:afterAutospacing="1" w:line="240" w:lineRule="auto"/>
+        <w:outlineLvl w:val="2"/>
+        <w:rPr>
+          <w:rFonts w:ascii="Times New Roman" w:eastAsia="Times New Roman" w:hAnsi="Times New Roman" w:cs="Times New Roman"/>
+          <w:sz w:val="24"/>
+          <w:szCs w:val="24"/>
+        </w:rPr>
+      </w:pPr>
+      <w:r>
+        <w:rPr>
+          <w:rFonts w:ascii="Times New Roman" w:eastAsia="Times New Roman" w:hAnsi="Times New Roman" w:cs="Times New Roman"/>
+          <w:sz w:val="24"/>
+          <w:szCs w:val="24"/>
+        </w:rPr>
+        <w:drawing>
+          <wp:inline distT="0" distB="0" distL="0" distR="0" wp14:anchorId="2AC54BFE" wp14:editId="2FCC99F1">
+            <wp:extent cx="5943600" cy="4055745"/>
+            <wp:effectExtent l="0" t="0" r="0" b="1905"/>
+            <wp:docPr id="62" name="Picture 62"/>
+            <wp:cNvGraphicFramePr>
+              <a:graphicFrameLocks xmlns:a="http://schemas.openxmlformats.org/drawingml/2006/main" noChangeAspect="1"/>
+            </wp:cNvGraphicFramePr>
+            <a:graphic xmlns:a="http://schemas.openxmlformats.org/drawingml/2006/main">
+              <a:graphicData uri="http://schemas.openxmlformats.org/drawingml/2006/picture">
+                <pic:pic xmlns:pic="http://schemas.openxmlformats.org/drawingml/2006/picture">
+                  <pic:nvPicPr>
+                    <pic:cNvPr id="1" name=""/>
+                    <pic:cNvPicPr/>
+                  </pic:nvPicPr>
+                  <pic:blipFill>
+                    <a:blip r:embed="rId69"/>
+                    <a:stretch>
+                      <a:fillRect/>
+                    </a:stretch>
+                  </pic:blipFill>
+                  <pic:spPr>
+                    <a:xfrm>
+                      <a:off x="0" y="0"/>
+                      <a:ext cx="5943600" cy="4055745"/>
+                    </a:xfrm>
+                    <a:prstGeom prst="rect">
+                      <a:avLst/>
+                    </a:prstGeom>
+                  </pic:spPr>
+                </pic:pic>
+              </a:graphicData>
+            </a:graphic>
+          </wp:inline>
+        </w:drawing>
+      </w:r>
+    </w:p>
+    <w:p>
+      <w:pPr>
+        <w:spacing w:before="100" w:beforeAutospacing="1" w:after="100" w:afterAutospacing="1" w:line="240" w:lineRule="auto"/>
+        <w:outlineLvl w:val="2"/>
+        <w:rPr>
+          <w:rFonts w:ascii="Times New Roman" w:eastAsia="Times New Roman" w:hAnsi="Times New Roman" w:cs="Times New Roman"/>
+          <w:sz w:val="24"/>
+          <w:szCs w:val="24"/>
+        </w:rPr>
+      </w:pPr>
+      <w:r>
+        <w:rPr>
+          <w:rFonts w:ascii="Times New Roman" w:eastAsia="Times New Roman" w:hAnsi="Times New Roman" w:cs="Times New Roman"/>
+          <w:sz w:val="24"/>
+          <w:szCs w:val="24"/>
+        </w:rPr>
+        <w:lastRenderedPageBreak/>
+        <w:drawing>
+          <wp:inline distT="0" distB="0" distL="0" distR="0" wp14:anchorId="7DFB0CC4" wp14:editId="2325BA82">
+            <wp:extent cx="5153744" cy="2191056"/>
+            <wp:effectExtent l="0" t="0" r="0" b="0"/>
+            <wp:docPr id="63" name="Picture 63"/>
+            <wp:cNvGraphicFramePr>
+              <a:graphicFrameLocks xmlns:a="http://schemas.openxmlformats.org/drawingml/2006/main" noChangeAspect="1"/>
+            </wp:cNvGraphicFramePr>
+            <a:graphic xmlns:a="http://schemas.openxmlformats.org/drawingml/2006/main">
+              <a:graphicData uri="http://schemas.openxmlformats.org/drawingml/2006/picture">
+                <pic:pic xmlns:pic="http://schemas.openxmlformats.org/drawingml/2006/picture">
+                  <pic:nvPicPr>
+                    <pic:cNvPr id="1" name=""/>
+                    <pic:cNvPicPr/>
+                  </pic:nvPicPr>
+                  <pic:blipFill>
+                    <a:blip r:embed="rId70"/>
+                    <a:stretch>
+                      <a:fillRect/>
+                    </a:stretch>
+                  </pic:blipFill>
+                  <pic:spPr>
+                    <a:xfrm>
+                      <a:off x="0" y="0"/>
+                      <a:ext cx="5153744" cy="2191056"/>
+                    </a:xfrm>
+                    <a:prstGeom prst="rect">
+                      <a:avLst/>
+                    </a:prstGeom>
+                  </pic:spPr>
+                </pic:pic>
+              </a:graphicData>
+            </a:graphic>
+          </wp:inline>
+        </w:drawing>
+      </w:r>
+    </w:p>
+    <w:p>
+      <w:pPr>
+        <w:spacing w:before="100" w:beforeAutospacing="1" w:after="100" w:afterAutospacing="1" w:line="240" w:lineRule="auto"/>
+        <w:outlineLvl w:val="2"/>
+        <w:rPr>
+          <w:rFonts w:ascii="Times New Roman" w:eastAsia="Times New Roman" w:hAnsi="Times New Roman" w:cs="Times New Roman"/>
+          <w:b/>
+          <w:bCs/>
+          <w:sz w:val="27"/>
+          <w:szCs w:val="27"/>
+        </w:rPr>
+      </w:pPr>
+      <w:r>
+        <w:rPr>
+          <w:rFonts w:ascii="Times New Roman" w:eastAsia="Times New Roman" w:hAnsi="Times New Roman" w:cs="Times New Roman"/>
+          <w:b/>
+          <w:bCs/>
+          <w:sz w:val="27"/>
+          <w:szCs w:val="27"/>
+        </w:rPr>
+        <w:t>Fig 3: Wireshark Traffic Capture</w:t>
+      </w:r>
+    </w:p>
+    <w:p>
+      <w:pPr>
+        <w:spacing w:before="100" w:beforeAutospacing="1" w:after="100" w:afterAutospacing="1" w:line="240" w:lineRule="auto"/>
+        <w:outlineLvl w:val="2"/>
+        <w:rPr>
+          <w:rFonts w:ascii="Times New Roman" w:eastAsia="Times New Roman" w:hAnsi="Times New Roman" w:cs="Times New Roman"/>
+          <w:sz w:val="24"/>
+          <w:szCs w:val="24"/>
+        </w:rPr>
+      </w:pPr>
+      <w:r>
+        <w:rPr>
+          <w:rFonts w:ascii="Times New Roman" w:eastAsia="Times New Roman" w:hAnsi="Times New Roman" w:cs="Times New Roman"/>
+          <w:sz w:val="24"/>
+          <w:szCs w:val="24"/>
+        </w:rPr>
+        <w:t>A simulated Wireshark packet capture of TLS traffic is presented. As seen in the capture, the Client Hello, Server Hello, Certificate exchange, and encrypted application data packets are visible. Analysis shows that all traffic is encrypted with AES-256</w:t>
+      </w:r>
+      <w:r>
+        <w:rPr>
+          <w:rFonts w:ascii="Times New Roman" w:eastAsia="Times New Roman" w:hAnsi="Times New Roman" w:cs="Times New Roman"/>
+          <w:sz w:val="24"/>
+          <w:szCs w:val="24"/>
+        </w:rPr>
+        <w:t xml:space="preserve"> </w:t>
+      </w:r>
+      <w:r>
+        <w:rPr>
+          <w:rFonts w:ascii="Times New Roman" w:eastAsia="Times New Roman" w:hAnsi="Times New Roman" w:cs="Times New Roman"/>
+          <w:sz w:val="24"/>
+          <w:szCs w:val="24"/>
+        </w:rPr>
+        <w:t>no plaintext data is present. The protocol statistics indicate that 100% of the traffic is TLS/SSL, which establishes a secure channel.</w:t>
+      </w:r>
+    </w:p>
+    <w:p>
+      <w:pPr>
+        <w:spacing w:before="100" w:beforeAutospacing="1" w:after="100" w:afterAutospacing="1" w:line="240" w:lineRule="auto"/>
+        <w:outlineLvl w:val="2"/>
+        <w:rPr>
+          <w:rFonts w:ascii="Times New Roman" w:eastAsia="Times New Roman" w:hAnsi="Times New Roman" w:cs="Times New Roman"/>
+          <w:sz w:val="24"/>
+          <w:szCs w:val="24"/>
+        </w:rPr>
+      </w:pPr>
+      <w:r>
+        <w:rPr>
+          <w:rFonts w:ascii="Times New Roman" w:eastAsia="Times New Roman" w:hAnsi="Times New Roman" w:cs="Times New Roman"/>
+          <w:sz w:val="24"/>
+          <w:szCs w:val="24"/>
+        </w:rPr>
+        <w:drawing>
+          <wp:inline distT="0" distB="0" distL="0" distR="0" wp14:anchorId="57D2A208" wp14:editId="4FD6E942">
+            <wp:extent cx="5943600" cy="3546475"/>
+            <wp:effectExtent l="0" t="0" r="0" b="0"/>
+            <wp:docPr id="64" name="Picture 64"/>
+            <wp:cNvGraphicFramePr>
+              <a:graphicFrameLocks xmlns:a="http://schemas.openxmlformats.org/drawingml/2006/main" noChangeAspect="1"/>
+            </wp:cNvGraphicFramePr>
+            <a:graphic xmlns:a="http://schemas.openxmlformats.org/drawingml/2006/main">
+              <a:graphicData uri="http://schemas.openxmlformats.org/drawingml/2006/picture">
+                <pic:pic xmlns:pic="http://schemas.openxmlformats.org/drawingml/2006/picture">
+                  <pic:nvPicPr>
+                    <pic:cNvPr id="1" name=""/>
+                    <pic:cNvPicPr/>
+                  </pic:nvPicPr>
+                  <pic:blipFill>
+                    <a:blip r:embed="rId71"/>
+                    <a:stretch>
+                      <a:fillRect/>
+                    </a:stretch>
+                  </pic:blipFill>
+                  <pic:spPr>
+                    <a:xfrm>
+                      <a:off x="0" y="0"/>
+                      <a:ext cx="5943600" cy="3546475"/>
+                    </a:xfrm>
+                    <a:prstGeom prst="rect">
+                      <a:avLst/>
+                    </a:prstGeom>
+                  </pic:spPr>
+                </pic:pic>
+              </a:graphicData>
+            </a:graphic>
+          </wp:inline>
+        </w:drawing>
+      </w:r>
+    </w:p>
+    <w:p>
+      <w:pPr>
+        <w:spacing w:before="100" w:beforeAutospacing="1" w:after="100" w:afterAutospacing="1" w:line="240" w:lineRule="auto"/>
+        <w:outlineLvl w:val="2"/>
+        <w:rPr>
+          <w:rFonts w:ascii="Times New Roman" w:eastAsia="Times New Roman" w:hAnsi="Times New Roman" w:cs="Times New Roman"/>
+          <w:sz w:val="24"/>
+          <w:szCs w:val="24"/>
+        </w:rPr>
+      </w:pPr>
+      <w:r>
+        <w:rPr>
+          <w:rFonts w:ascii="Times New Roman" w:eastAsia="Times New Roman" w:hAnsi="Times New Roman" w:cs="Times New Roman"/>
+          <w:sz w:val="24"/>
+          <w:szCs w:val="24"/>
+        </w:rPr>
+        <w:lastRenderedPageBreak/>
+        <w:drawing>
+          <wp:inline distT="0" distB="0" distL="0" distR="0" wp14:anchorId="3EBCEC77" wp14:editId="70C863CC">
+            <wp:extent cx="3600953" cy="1076475"/>
+            <wp:effectExtent l="0" t="0" r="0" b="9525"/>
+            <wp:docPr id="65" name="Picture 65"/>
+            <wp:cNvGraphicFramePr>
+              <a:graphicFrameLocks xmlns:a="http://schemas.openxmlformats.org/drawingml/2006/main" noChangeAspect="1"/>
+            </wp:cNvGraphicFramePr>
+            <a:graphic xmlns:a="http://schemas.openxmlformats.org/drawingml/2006/main">
+              <a:graphicData uri="http://schemas.openxmlformats.org/drawingml/2006/picture">
+                <pic:pic xmlns:pic="http://schemas.openxmlformats.org/drawingml/2006/picture">
+                  <pic:nvPicPr>
+                    <pic:cNvPr id="1" name=""/>
+                    <pic:cNvPicPr/>
+                  </pic:nvPicPr>
+                  <pic:blipFill>
+                    <a:blip r:embed="rId72"/>
+                    <a:stretch>
+                      <a:fillRect/>
+                    </a:stretch>
+                  </pic:blipFill>
+                  <pic:spPr>
+                    <a:xfrm>
+                      <a:off x="0" y="0"/>
+                      <a:ext cx="3600953" cy="1076475"/>
+                    </a:xfrm>
+                    <a:prstGeom prst="rect">
+                      <a:avLst/>
+                    </a:prstGeom>
+                  </pic:spPr>
+                </pic:pic>
+              </a:graphicData>
+            </a:graphic>
+          </wp:inline>
+        </w:drawing>
+      </w:r>
+    </w:p>
+    <w:p>
+      <w:pPr>
+        <w:spacing w:before="100" w:beforeAutospacing="1" w:after="100" w:afterAutospacing="1" w:line="240" w:lineRule="auto"/>
+        <w:outlineLvl w:val="2"/>
+        <w:rPr>
+          <w:rFonts w:ascii="Times New Roman" w:eastAsia="Times New Roman" w:hAnsi="Times New Roman" w:cs="Times New Roman"/>
+          <w:b/>
+          <w:bCs/>
+          <w:sz w:val="27"/>
+          <w:szCs w:val="27"/>
+        </w:rPr>
+      </w:pPr>
+      <w:r>
+        <w:rPr>
+          <w:rFonts w:ascii="Times New Roman" w:eastAsia="Times New Roman" w:hAnsi="Times New Roman" w:cs="Times New Roman"/>
+          <w:b/>
+          <w:bCs/>
+          <w:sz w:val="27"/>
+          <w:szCs w:val="27"/>
+        </w:rPr>
+        <w:t>Fig 4: Encrypted Data Transmission</w:t>
+      </w:r>
+    </w:p>
+    <w:p>
+      <w:pPr>
+        <w:spacing w:before="100" w:beforeAutospacing="1" w:after="100" w:afterAutospacing="1" w:line="240" w:lineRule="auto"/>
+        <w:outlineLvl w:val="2"/>
+        <w:rPr>
+          <w:rFonts w:ascii="Times New Roman" w:eastAsia="Times New Roman" w:hAnsi="Times New Roman" w:cs="Times New Roman"/>
+          <w:sz w:val="24"/>
+          <w:szCs w:val="24"/>
+        </w:rPr>
+      </w:pPr>
+      <w:r>
+        <w:rPr>
+          <w:rFonts w:ascii="Times New Roman" w:eastAsia="Times New Roman" w:hAnsi="Times New Roman" w:cs="Times New Roman"/>
+          <w:sz w:val="24"/>
+          <w:szCs w:val="24"/>
+        </w:rPr>
+        <w:t>R</w:t>
+      </w:r>
+      <w:r>
+        <w:rPr>
+          <w:rFonts w:ascii="Times New Roman" w:eastAsia="Times New Roman" w:hAnsi="Times New Roman" w:cs="Times New Roman"/>
+          <w:sz w:val="24"/>
+          <w:szCs w:val="24"/>
+        </w:rPr>
+        <w:t>epresents the transmission of encrypted data using a secure channel. A session key is generated and then data is encrypted using AES-256-GCM and sent. At the receiver end, it is decrypted properly. Confidential message ('Launch codes...') is encrypted during the transmission and integrity is checked. This is a realistic secure communication simulation.</w:t>
+      </w:r>
+    </w:p>
+    <w:p>
+      <w:pPr>
+        <w:spacing w:before="100" w:beforeAutospacing="1" w:after="100" w:afterAutospacing="1" w:line="240" w:lineRule="auto"/>
+        <w:outlineLvl w:val="2"/>
+        <w:rPr>
+          <w:rFonts w:ascii="Times New Roman" w:eastAsia="Times New Roman" w:hAnsi="Times New Roman" w:cs="Times New Roman"/>
+          <w:b/>
+          <w:bCs/>
+          <w:sz w:val="27"/>
+          <w:szCs w:val="27"/>
+        </w:rPr>
+      </w:pPr>
+      <w:r>
+        <w:rPr>
+          <w:rFonts w:ascii="Times New Roman" w:eastAsia="Times New Roman" w:hAnsi="Times New Roman" w:cs="Times New Roman"/>
+          <w:b/>
+          <w:bCs/>
+          <w:sz w:val="27"/>
+          <w:szCs w:val="27"/>
+        </w:rPr>
+        <w:drawing>
+          <wp:inline distT="0" distB="0" distL="0" distR="0" wp14:anchorId="60A11647" wp14:editId="1BD13103">
+            <wp:extent cx="5943600" cy="3928110"/>
+            <wp:effectExtent l="0" t="0" r="0" b="0"/>
+            <wp:docPr id="66" name="Picture 66"/>
+            <wp:cNvGraphicFramePr>
+              <a:graphicFrameLocks xmlns:a="http://schemas.openxmlformats.org/drawingml/2006/main" noChangeAspect="1"/>
+            </wp:cNvGraphicFramePr>
+            <a:graphic xmlns:a="http://schemas.openxmlformats.org/drawingml/2006/main">
+              <a:graphicData uri="http://schemas.openxmlformats.org/drawingml/2006/picture">
+                <pic:pic xmlns:pic="http://schemas.openxmlformats.org/drawingml/2006/picture">
+                  <pic:nvPicPr>
+                    <pic:cNvPr id="1" name=""/>
+                    <pic:cNvPicPr/>
+                  </pic:nvPicPr>
+                  <pic:blipFill>
+                    <a:blip r:embed="rId73"/>
+                    <a:stretch>
+                      <a:fillRect/>
+                    </a:stretch>
+                  </pic:blipFill>
+                  <pic:spPr>
+                    <a:xfrm>
+                      <a:off x="0" y="0"/>
+                      <a:ext cx="5943600" cy="3928110"/>
+                    </a:xfrm>
+                    <a:prstGeom prst="rect">
+                      <a:avLst/>
+                    </a:prstGeom>
+                  </pic:spPr>
+                </pic:pic>
+              </a:graphicData>
+            </a:graphic>
+          </wp:inline>
+        </w:drawing>
+      </w:r>
+    </w:p>
+    <w:p>
+      <w:pPr>
+        <w:spacing w:before="100" w:beforeAutospacing="1" w:after="100" w:afterAutospacing="1" w:line="240" w:lineRule="auto"/>
+        <w:outlineLvl w:val="2"/>
+        <w:rPr>
+          <w:rFonts w:ascii="Times New Roman" w:eastAsia="Times New Roman" w:hAnsi="Times New Roman" w:cs="Times New Roman"/>
+          <w:b/>
+          <w:bCs/>
+          <w:sz w:val="27"/>
+          <w:szCs w:val="27"/>
+        </w:rPr>
+      </w:pPr>
+      <w:r>
+        <w:rPr>
+          <w:rFonts w:ascii="Times New Roman" w:eastAsia="Times New Roman" w:hAnsi="Times New Roman" w:cs="Times New Roman"/>
+          <w:b/>
+          <w:bCs/>
+          <w:sz w:val="27"/>
+          <w:szCs w:val="27"/>
+        </w:rPr>
+        <w:t>Fig 5: Protocol Security Analysis</w:t>
+      </w:r>
+    </w:p>
+    <w:p>
+      <w:pPr>
+        <w:spacing w:before="100" w:beforeAutospacing="1" w:after="100" w:afterAutospacing="1" w:line="240" w:lineRule="auto"/>
+        <w:outlineLvl w:val="2"/>
+        <w:rPr>
+          <w:rFonts w:ascii="Times New Roman" w:eastAsia="Times New Roman" w:hAnsi="Times New Roman" w:cs="Times New Roman"/>
+          <w:sz w:val="27"/>
+          <w:szCs w:val="27"/>
+        </w:rPr>
+      </w:pPr>
+      <w:r>
+        <w:rPr>
+          <w:rFonts w:ascii="Times New Roman" w:eastAsia="Times New Roman" w:hAnsi="Times New Roman" w:cs="Times New Roman"/>
+          <w:sz w:val="24"/>
+          <w:szCs w:val="24"/>
+        </w:rPr>
+        <w:t>A detailed security protocol comparison is given in Figure 5. Secure protocols provide strong encryption, strong authentication, insecure protocols transmit data in plain text and are susceptible. The SSL 3.0 protocol is broken, TLS 1.3 has no known vulnerabilities. The recommendations are TLS1.2+ and enabling HSTS</w:t>
+      </w:r>
+      <w:r>
+        <w:rPr>
+          <w:rFonts w:ascii="Times New Roman" w:eastAsia="Times New Roman" w:hAnsi="Times New Roman" w:cs="Times New Roman"/>
+          <w:sz w:val="27"/>
+          <w:szCs w:val="27"/>
+        </w:rPr>
+        <w:t>.</w:t>
+      </w:r>
+    </w:p>
+    <w:p>
+      <w:pPr>
+        <w:spacing w:before="100" w:beforeAutospacing="1" w:after="100" w:afterAutospacing="1" w:line="240" w:lineRule="auto"/>
+        <w:outlineLvl w:val="2"/>
+        <w:rPr>
+          <w:rFonts w:ascii="Times New Roman" w:eastAsia="Times New Roman" w:hAnsi="Times New Roman" w:cs="Times New Roman"/>
+          <w:sz w:val="27"/>
+          <w:szCs w:val="27"/>
+        </w:rPr>
+      </w:pPr>
+      <w:r>
+        <w:rPr>
+          <w:rFonts w:ascii="Times New Roman" w:eastAsia="Times New Roman" w:hAnsi="Times New Roman" w:cs="Times New Roman"/>
+          <w:sz w:val="27"/>
+          <w:szCs w:val="27"/>
+        </w:rPr>
+        <w:lastRenderedPageBreak/>
+        <w:drawing>
+          <wp:inline distT="0" distB="0" distL="0" distR="0" wp14:anchorId="60195BF8" wp14:editId="73606290">
+            <wp:extent cx="5943600" cy="3056890"/>
+            <wp:effectExtent l="0" t="0" r="0" b="0"/>
+            <wp:docPr id="67" name="Picture 67"/>
+            <wp:cNvGraphicFramePr>
+              <a:graphicFrameLocks xmlns:a="http://schemas.openxmlformats.org/drawingml/2006/main" noChangeAspect="1"/>
+            </wp:cNvGraphicFramePr>
+            <a:graphic xmlns:a="http://schemas.openxmlformats.org/drawingml/2006/main">
+              <a:graphicData uri="http://schemas.openxmlformats.org/drawingml/2006/picture">
+                <pic:pic xmlns:pic="http://schemas.openxmlformats.org/drawingml/2006/picture">
+                  <pic:nvPicPr>
+                    <pic:cNvPr id="1" name=""/>
+                    <pic:cNvPicPr/>
+                  </pic:nvPicPr>
+                  <pic:blipFill>
+                    <a:blip r:embed="rId74"/>
+                    <a:stretch>
+                      <a:fillRect/>
+                    </a:stretch>
+                  </pic:blipFill>
+                  <pic:spPr>
+                    <a:xfrm>
+                      <a:off x="0" y="0"/>
+                      <a:ext cx="5943600" cy="3056890"/>
+                    </a:xfrm>
+                    <a:prstGeom prst="rect">
+                      <a:avLst/>
+                    </a:prstGeom>
+                  </pic:spPr>
+                </pic:pic>
+              </a:graphicData>
+            </a:graphic>
+          </wp:inline>
+        </w:drawing>
+      </w:r>
+    </w:p>
+    <w:p>
+      <w:pPr>
+        <w:spacing w:before="100" w:beforeAutospacing="1" w:after="100" w:afterAutospacing="1" w:line="240" w:lineRule="auto"/>
+        <w:outlineLvl w:val="2"/>
+        <w:rPr>
+          <w:rFonts w:ascii="Times New Roman" w:eastAsia="Times New Roman" w:hAnsi="Times New Roman" w:cs="Times New Roman"/>
+          <w:sz w:val="27"/>
+          <w:szCs w:val="27"/>
+        </w:rPr>
+      </w:pPr>
+      <w:r>
+        <w:rPr>
+          <w:rFonts w:ascii="Times New Roman" w:eastAsia="Times New Roman" w:hAnsi="Times New Roman" w:cs="Times New Roman"/>
+          <w:sz w:val="27"/>
+          <w:szCs w:val="27"/>
+        </w:rPr>
+        <w:drawing>
+          <wp:inline distT="0" distB="0" distL="0" distR="0" wp14:anchorId="6393285B" wp14:editId="1F801635">
+            <wp:extent cx="5020376" cy="2210108"/>
+            <wp:effectExtent l="0" t="0" r="8890" b="0"/>
+            <wp:docPr id="68" name="Picture 68"/>
+            <wp:cNvGraphicFramePr>
+              <a:graphicFrameLocks xmlns:a="http://schemas.openxmlformats.org/drawingml/2006/main" noChangeAspect="1"/>
+            </wp:cNvGraphicFramePr>
+            <a:graphic xmlns:a="http://schemas.openxmlformats.org/drawingml/2006/main">
+              <a:graphicData uri="http://schemas.openxmlformats.org/drawingml/2006/picture">
+                <pic:pic xmlns:pic="http://schemas.openxmlformats.org/drawingml/2006/picture">
+                  <pic:nvPicPr>
+                    <pic:cNvPr id="1" name=""/>
+                    <pic:cNvPicPr/>
+                  </pic:nvPicPr>
+                  <pic:blipFill>
+                    <a:blip r:embed="rId75"/>
+                    <a:stretch>
+                      <a:fillRect/>
+                    </a:stretch>
+                  </pic:blipFill>
+                  <pic:spPr>
+                    <a:xfrm>
+                      <a:off x="0" y="0"/>
+                      <a:ext cx="5020376" cy="2210108"/>
+                    </a:xfrm>
+                    <a:prstGeom prst="rect">
+                      <a:avLst/>
+                    </a:prstGeom>
+                  </pic:spPr>
+                </pic:pic>
+              </a:graphicData>
+            </a:graphic>
+          </wp:inline>
+        </w:drawing>
+      </w:r>
+    </w:p>
+    <w:p>
+      <w:pPr>
+        <w:spacing w:before="100" w:beforeAutospacing="1" w:after="100" w:afterAutospacing="1" w:line="240" w:lineRule="auto"/>
+        <w:outlineLvl w:val="2"/>
+        <w:rPr>
+          <w:rFonts w:ascii="Times New Roman" w:eastAsia="Times New Roman" w:hAnsi="Times New Roman" w:cs="Times New Roman"/>
+          <w:b/>
+          <w:bCs/>
+          <w:sz w:val="27"/>
+          <w:szCs w:val="27"/>
+        </w:rPr>
+      </w:pPr>
+      <w:r>
+        <w:rPr>
+          <w:rFonts w:ascii="Times New Roman" w:eastAsia="Times New Roman" w:hAnsi="Times New Roman" w:cs="Times New Roman"/>
+          <w:b/>
+          <w:bCs/>
+          <w:sz w:val="27"/>
+          <w:szCs w:val="27"/>
+        </w:rPr>
+        <w:t>REFLECTION</w:t>
+      </w:r>
+    </w:p>
+    <w:p>
+      <w:pPr>
+        <w:spacing w:before="100" w:beforeAutospacing="1" w:after="100" w:afterAutospacing="1" w:line="240" w:lineRule="auto"/>
+        <w:outlineLvl w:val="2"/>
+        <w:rPr>
+          <w:rFonts w:ascii="Times New Roman" w:eastAsia="Times New Roman" w:hAnsi="Times New Roman" w:cs="Times New Roman"/>
+          <w:sz w:val="24"/>
+          <w:szCs w:val="24"/>
+        </w:rPr>
+      </w:pPr>
+      <w:r>
+        <w:rPr>
+          <w:rFonts w:ascii="Times New Roman" w:eastAsia="Times New Roman" w:hAnsi="Times New Roman" w:cs="Times New Roman"/>
+          <w:sz w:val="24"/>
+          <w:szCs w:val="24"/>
+        </w:rPr>
+        <w:t>Secure communication is the process of encrypting data as it travels, by means of SSL/TLS. TLS handshake</w:t>
+      </w:r>
+      <w:r>
+        <w:rPr>
+          <w:rFonts w:ascii="Times New Roman" w:eastAsia="Times New Roman" w:hAnsi="Times New Roman" w:cs="Times New Roman"/>
+          <w:sz w:val="24"/>
+          <w:szCs w:val="24"/>
+        </w:rPr>
+        <w:t xml:space="preserve"> </w:t>
+      </w:r>
+      <w:r>
+        <w:rPr>
+          <w:rFonts w:ascii="Times New Roman" w:eastAsia="Times New Roman" w:hAnsi="Times New Roman" w:cs="Times New Roman"/>
+          <w:sz w:val="24"/>
+          <w:szCs w:val="24"/>
+        </w:rPr>
+        <w:t>creating secure channels with certificates and key exchange. You can see encrypted traffic as unreadable in Wireshark. HTTPS will provide confidentiality, authentication, and integrity. Issues are related to management of certificates and correct protocol configuration.</w:t>
+      </w:r>
+    </w:p>
+    <w:p>
+      <w:pPr>
+        <w:spacing w:before="100" w:beforeAutospacing="1" w:after="100" w:afterAutospacing="1" w:line="240" w:lineRule="auto"/>
+        <w:outlineLvl w:val="0"/>
+        <w:rPr>
+          <w:rFonts w:ascii="Times New Roman" w:eastAsia="Times New Roman" w:hAnsi="Times New Roman" w:cs="Times New Roman"/>
+          <w:b/>
+          <w:bCs/>
+          <w:kern w:val="36"/>
+          <w:sz w:val="32"/>
+          <w:szCs w:val="32"/>
+        </w:rPr>
+      </w:pPr>
+      <w:r>
+        <w:rPr>
+          <w:rFonts w:ascii="Times New Roman" w:eastAsia="Times New Roman" w:hAnsi="Times New Roman" w:cs="Times New Roman"/>
+          <w:b/>
+          <w:bCs/>
+          <w:kern w:val="36"/>
+          <w:sz w:val="32"/>
+          <w:szCs w:val="32"/>
+        </w:rPr>
+        <w:t>Practical Task</w:t>
+      </w:r>
+    </w:p>
+    <w:p>
+      <w:pPr>
+        <w:spacing w:before="100" w:beforeAutospacing="1" w:after="100" w:afterAutospacing="1" w:line="240" w:lineRule="auto"/>
+        <w:outlineLvl w:val="2"/>
+        <w:rPr>
+          <w:rFonts w:ascii="Times New Roman" w:eastAsia="Times New Roman" w:hAnsi="Times New Roman" w:cs="Times New Roman"/>
+          <w:b/>
+          <w:bCs/>
+          <w:sz w:val="27"/>
+          <w:szCs w:val="27"/>
+        </w:rPr>
+      </w:pPr>
+      <w:r>
+        <w:rPr>
+          <w:rFonts w:ascii="Times New Roman" w:eastAsia="Times New Roman" w:hAnsi="Times New Roman" w:cs="Times New Roman"/>
+          <w:b/>
+          <w:bCs/>
+          <w:sz w:val="27"/>
+          <w:szCs w:val="27"/>
+        </w:rPr>
+        <w:t>OpenSSL Certificate Inspection</w:t>
+      </w:r>
+    </w:p>
+    <w:p>
+      <w:pPr>
+        <w:spacing w:before="100" w:beforeAutospacing="1" w:after="100" w:afterAutospacing="1" w:line="240" w:lineRule="auto"/>
+        <w:outlineLvl w:val="2"/>
+        <w:rPr>
+          <w:rFonts w:ascii="Times New Roman" w:eastAsia="Times New Roman" w:hAnsi="Times New Roman" w:cs="Times New Roman"/>
+          <w:b/>
+          <w:bCs/>
+          <w:sz w:val="27"/>
+          <w:szCs w:val="27"/>
+        </w:rPr>
+      </w:pPr>
+      <w:r>
+        <w:rPr>
+          <w:rFonts w:ascii="Times New Roman" w:eastAsia="Times New Roman" w:hAnsi="Times New Roman" w:cs="Times New Roman"/>
+          <w:b/>
+          <w:bCs/>
+          <w:sz w:val="27"/>
+          <w:szCs w:val="27"/>
+        </w:rPr>
+        <w:lastRenderedPageBreak/>
+        <w:drawing>
+          <wp:inline distT="0" distB="0" distL="0" distR="0" wp14:anchorId="2F8877C5" wp14:editId="471CF372">
+            <wp:extent cx="5943600" cy="3894455"/>
+            <wp:effectExtent l="0" t="0" r="0" b="0"/>
+            <wp:docPr id="69" name="Picture 69"/>
+            <wp:cNvGraphicFramePr>
+              <a:graphicFrameLocks xmlns:a="http://schemas.openxmlformats.org/drawingml/2006/main" noChangeAspect="1"/>
+            </wp:cNvGraphicFramePr>
+            <a:graphic xmlns:a="http://schemas.openxmlformats.org/drawingml/2006/main">
+              <a:graphicData uri="http://schemas.openxmlformats.org/drawingml/2006/picture">
+                <pic:pic xmlns:pic="http://schemas.openxmlformats.org/drawingml/2006/picture">
+                  <pic:nvPicPr>
+                    <pic:cNvPr id="1" name=""/>
+                    <pic:cNvPicPr/>
+                  </pic:nvPicPr>
+                  <pic:blipFill>
+                    <a:blip r:embed="rId76"/>
+                    <a:stretch>
+                      <a:fillRect/>
+                    </a:stretch>
+                  </pic:blipFill>
+                  <pic:spPr>
+                    <a:xfrm>
+                      <a:off x="0" y="0"/>
+                      <a:ext cx="5943600" cy="3894455"/>
+                    </a:xfrm>
+                    <a:prstGeom prst="rect">
+                      <a:avLst/>
+                    </a:prstGeom>
+                  </pic:spPr>
+                </pic:pic>
+              </a:graphicData>
+            </a:graphic>
+          </wp:inline>
+        </w:drawing>
+      </w:r>
+    </w:p>
+    <w:p>
+      <w:pPr>
+        <w:spacing w:before="100" w:beforeAutospacing="1" w:after="100" w:afterAutospacing="1" w:line="240" w:lineRule="auto"/>
+        <w:outlineLvl w:val="2"/>
+        <w:rPr>
+          <w:rFonts w:ascii="Times New Roman" w:eastAsia="Times New Roman" w:hAnsi="Times New Roman" w:cs="Times New Roman"/>
+          <w:sz w:val="24"/>
+          <w:szCs w:val="24"/>
+        </w:rPr>
+      </w:pPr>
+      <w:r>
+        <w:rPr>
+          <w:rFonts w:ascii="Times New Roman" w:eastAsia="Times New Roman" w:hAnsi="Times New Roman" w:cs="Times New Roman"/>
+          <w:sz w:val="24"/>
+          <w:szCs w:val="24"/>
+        </w:rPr>
+        <w:t xml:space="preserve">Check Google's TLS certificate using PowerShell. The certificate was issued by Google Trust </w:t>
+      </w:r>
+      <w:r>
+        <w:rPr>
+          <w:rFonts w:ascii="Times New Roman" w:eastAsia="Times New Roman" w:hAnsi="Times New Roman" w:cs="Times New Roman"/>
+          <w:sz w:val="24"/>
+          <w:szCs w:val="24"/>
+        </w:rPr>
+        <w:t>Services and</w:t>
+      </w:r>
+      <w:r>
+        <w:rPr>
+          <w:rFonts w:ascii="Times New Roman" w:eastAsia="Times New Roman" w:hAnsi="Times New Roman" w:cs="Times New Roman"/>
+          <w:sz w:val="24"/>
+          <w:szCs w:val="24"/>
+        </w:rPr>
+        <w:t xml:space="preserve"> it states that the subject is www.google.com with ECDSA key algorithm. The certificate is valid from June 8, 2026 to August 31, 2026 with serial number 6F33BD7E0EB59B640A33301CBA82ECF6. This proves that Google is implementing up-to-date elliptic curve cryptography (ECC) for secure HTTPS connections.</w:t>
+      </w:r>
+    </w:p>
+    <w:p>
+      <w:pPr>
+        <w:spacing w:before="100" w:beforeAutospacing="1" w:after="100" w:afterAutospacing="1" w:line="240" w:lineRule="auto"/>
+        <w:outlineLvl w:val="2"/>
+        <w:rPr>
+          <w:rFonts w:ascii="Times New Roman" w:eastAsia="Times New Roman" w:hAnsi="Times New Roman" w:cs="Times New Roman"/>
+          <w:sz w:val="24"/>
+          <w:szCs w:val="24"/>
+        </w:rPr>
+      </w:pPr>
+      <w:r>
+        <w:rPr>
+          <w:rFonts w:ascii="Times New Roman" w:eastAsia="Times New Roman" w:hAnsi="Times New Roman" w:cs="Times New Roman"/>
+          <w:sz w:val="24"/>
+          <w:szCs w:val="24"/>
+        </w:rPr>
+        <w:lastRenderedPageBreak/>
+        <w:drawing>
+          <wp:inline distT="0" distB="0" distL="0" distR="0" wp14:anchorId="419530C0" wp14:editId="571F4DB7">
+            <wp:extent cx="5943600" cy="4625340"/>
+            <wp:effectExtent l="0" t="0" r="0" b="3810"/>
+            <wp:docPr id="70" name="Picture 70"/>
+            <wp:cNvGraphicFramePr>
+              <a:graphicFrameLocks xmlns:a="http://schemas.openxmlformats.org/drawingml/2006/main" noChangeAspect="1"/>
+            </wp:cNvGraphicFramePr>
+            <a:graphic xmlns:a="http://schemas.openxmlformats.org/drawingml/2006/main">
+              <a:graphicData uri="http://schemas.openxmlformats.org/drawingml/2006/picture">
+                <pic:pic xmlns:pic="http://schemas.openxmlformats.org/drawingml/2006/picture">
+                  <pic:nvPicPr>
+                    <pic:cNvPr id="1" name=""/>
+                    <pic:cNvPicPr/>
+                  </pic:nvPicPr>
+                  <pic:blipFill>
+                    <a:blip r:embed="rId77"/>
+                    <a:stretch>
+                      <a:fillRect/>
+                    </a:stretch>
+                  </pic:blipFill>
+                  <pic:spPr>
+                    <a:xfrm>
+                      <a:off x="0" y="0"/>
+                      <a:ext cx="5943600" cy="4625340"/>
+                    </a:xfrm>
+                    <a:prstGeom prst="rect">
+                      <a:avLst/>
+                    </a:prstGeom>
+                  </pic:spPr>
+                </pic:pic>
+              </a:graphicData>
+            </a:graphic>
+          </wp:inline>
+        </w:drawing>
+      </w:r>
+    </w:p>
+    <w:p>
+      <w:pPr>
+        <w:spacing w:before="100" w:beforeAutospacing="1" w:after="100" w:afterAutospacing="1" w:line="240" w:lineRule="auto"/>
+        <w:outlineLvl w:val="2"/>
+        <w:rPr>
+          <w:rFonts w:ascii="Times New Roman" w:eastAsia="Times New Roman" w:hAnsi="Times New Roman" w:cs="Times New Roman"/>
+          <w:sz w:val="24"/>
+          <w:szCs w:val="24"/>
+        </w:rPr>
+      </w:pPr>
+      <w:r>
+        <w:rPr>
+          <w:rFonts w:ascii="Times New Roman" w:eastAsia="Times New Roman" w:hAnsi="Times New Roman" w:cs="Times New Roman"/>
+          <w:sz w:val="24"/>
+          <w:szCs w:val="24"/>
+        </w:rPr>
+        <w:lastRenderedPageBreak/>
+        <w:drawing>
+          <wp:inline distT="0" distB="0" distL="0" distR="0" wp14:anchorId="0FF98BCD" wp14:editId="263E5D1D">
+            <wp:extent cx="5943600" cy="3700780"/>
+            <wp:effectExtent l="0" t="0" r="0" b="0"/>
+            <wp:docPr id="71" name="Picture 71"/>
+            <wp:cNvGraphicFramePr>
+              <a:graphicFrameLocks xmlns:a="http://schemas.openxmlformats.org/drawingml/2006/main" noChangeAspect="1"/>
+            </wp:cNvGraphicFramePr>
+            <a:graphic xmlns:a="http://schemas.openxmlformats.org/drawingml/2006/main">
+              <a:graphicData uri="http://schemas.openxmlformats.org/drawingml/2006/picture">
+                <pic:pic xmlns:pic="http://schemas.openxmlformats.org/drawingml/2006/picture">
+                  <pic:nvPicPr>
+                    <pic:cNvPr id="1" name=""/>
+                    <pic:cNvPicPr/>
+                  </pic:nvPicPr>
+                  <pic:blipFill>
+                    <a:blip r:embed="rId78"/>
+                    <a:stretch>
+                      <a:fillRect/>
+                    </a:stretch>
+                  </pic:blipFill>
+                  <pic:spPr>
+                    <a:xfrm>
+                      <a:off x="0" y="0"/>
+                      <a:ext cx="5943600" cy="3700780"/>
+                    </a:xfrm>
+                    <a:prstGeom prst="rect">
+                      <a:avLst/>
+                    </a:prstGeom>
+                  </pic:spPr>
+                </pic:pic>
+              </a:graphicData>
+            </a:graphic>
+          </wp:inline>
+        </w:drawing>
+      </w:r>
+    </w:p>
+    <w:p>
+      <w:pPr>
+        <w:spacing w:before="100" w:beforeAutospacing="1" w:after="100" w:afterAutospacing="1" w:line="240" w:lineRule="auto"/>
+        <w:outlineLvl w:val="0"/>
+        <w:rPr>
+          <w:rFonts w:ascii="Times New Roman" w:eastAsia="Times New Roman" w:hAnsi="Times New Roman" w:cs="Times New Roman"/>
+          <w:b/>
+          <w:bCs/>
+          <w:kern w:val="36"/>
+          <w:sz w:val="32"/>
+          <w:szCs w:val="32"/>
+        </w:rPr>
+      </w:pPr>
+      <w:r>
+        <w:rPr>
+          <w:rFonts w:ascii="Times New Roman" w:eastAsia="Times New Roman" w:hAnsi="Times New Roman" w:cs="Times New Roman"/>
+          <w:b/>
+          <w:bCs/>
+          <w:kern w:val="36"/>
+          <w:sz w:val="32"/>
+          <w:szCs w:val="32"/>
+        </w:rPr>
+        <w:t>Practical Task</w:t>
+      </w:r>
+    </w:p>
+    <w:p>
+      <w:pPr>
+        <w:spacing w:before="100" w:beforeAutospacing="1" w:after="100" w:afterAutospacing="1" w:line="240" w:lineRule="auto"/>
+        <w:outlineLvl w:val="1"/>
+        <w:rPr>
+          <w:rFonts w:ascii="Times New Roman" w:eastAsia="Times New Roman" w:hAnsi="Times New Roman" w:cs="Times New Roman"/>
+          <w:b/>
+          <w:bCs/>
+          <w:sz w:val="32"/>
+          <w:szCs w:val="32"/>
+        </w:rPr>
+      </w:pPr>
+      <w:r>
+        <w:rPr>
+          <w:rFonts w:ascii="Times New Roman" w:eastAsia="Times New Roman" w:hAnsi="Times New Roman" w:cs="Times New Roman"/>
+          <w:b/>
+          <w:bCs/>
+          <w:sz w:val="32"/>
+          <w:szCs w:val="32"/>
+        </w:rPr>
+        <w:t>Implementing Diffie-Hellman Key Exchange</w:t>
+      </w:r>
+    </w:p>
+    <w:p>
+      <w:pPr>
+        <w:spacing w:before="100" w:beforeAutospacing="1" w:after="100" w:afterAutospacing="1" w:line="240" w:lineRule="auto"/>
+        <w:outlineLvl w:val="1"/>
+        <w:rPr>
+          <w:rFonts w:ascii="Times New Roman" w:eastAsia="Times New Roman" w:hAnsi="Times New Roman" w:cs="Times New Roman"/>
+          <w:b/>
+          <w:bCs/>
+          <w:sz w:val="32"/>
+          <w:szCs w:val="32"/>
+        </w:rPr>
+      </w:pPr>
+      <w:r>
+        <w:rPr>
+          <w:rFonts w:ascii="Times New Roman" w:eastAsia="Times New Roman" w:hAnsi="Times New Roman" w:cs="Times New Roman"/>
+          <w:b/>
+          <w:bCs/>
+          <w:sz w:val="32"/>
+          <w:szCs w:val="32"/>
+        </w:rPr>
+        <w:lastRenderedPageBreak/>
+        <w:drawing>
+          <wp:inline distT="0" distB="0" distL="0" distR="0" wp14:anchorId="5820F64E" wp14:editId="0395E0C3">
+            <wp:extent cx="5401429" cy="4477375"/>
+            <wp:effectExtent l="0" t="0" r="8890" b="0"/>
+            <wp:docPr id="72" name="Picture 72"/>
+            <wp:cNvGraphicFramePr>
+              <a:graphicFrameLocks xmlns:a="http://schemas.openxmlformats.org/drawingml/2006/main" noChangeAspect="1"/>
+            </wp:cNvGraphicFramePr>
+            <a:graphic xmlns:a="http://schemas.openxmlformats.org/drawingml/2006/main">
+              <a:graphicData uri="http://schemas.openxmlformats.org/drawingml/2006/picture">
+                <pic:pic xmlns:pic="http://schemas.openxmlformats.org/drawingml/2006/picture">
+                  <pic:nvPicPr>
+                    <pic:cNvPr id="1" name=""/>
+                    <pic:cNvPicPr/>
+                  </pic:nvPicPr>
+                  <pic:blipFill>
+                    <a:blip r:embed="rId79"/>
+                    <a:stretch>
+                      <a:fillRect/>
+                    </a:stretch>
+                  </pic:blipFill>
+                  <pic:spPr>
+                    <a:xfrm>
+                      <a:off x="0" y="0"/>
+                      <a:ext cx="5401429" cy="4477375"/>
+                    </a:xfrm>
+                    <a:prstGeom prst="rect">
+                      <a:avLst/>
+                    </a:prstGeom>
+                  </pic:spPr>
+                </pic:pic>
+              </a:graphicData>
+            </a:graphic>
+          </wp:inline>
+        </w:drawing>
+      </w:r>
+    </w:p>
+    <w:p>
+      <w:pPr>
+        <w:spacing w:before="100" w:beforeAutospacing="1" w:after="100" w:afterAutospacing="1" w:line="240" w:lineRule="auto"/>
+        <w:outlineLvl w:val="1"/>
+        <w:rPr>
+          <w:rFonts w:ascii="Times New Roman" w:eastAsia="Times New Roman" w:hAnsi="Times New Roman" w:cs="Times New Roman"/>
+          <w:b/>
+          <w:bCs/>
+          <w:sz w:val="32"/>
+          <w:szCs w:val="32"/>
+        </w:rPr>
+      </w:pPr>
+      <w:r>
+        <w:rPr>
+          <w:rFonts w:ascii="Times New Roman" w:eastAsia="Times New Roman" w:hAnsi="Times New Roman" w:cs="Times New Roman"/>
+          <w:b/>
+          <w:bCs/>
+          <w:sz w:val="32"/>
+          <w:szCs w:val="32"/>
+        </w:rPr>
+        <w:lastRenderedPageBreak/>
+        <w:drawing>
+          <wp:inline distT="0" distB="0" distL="0" distR="0" wp14:anchorId="3196070F" wp14:editId="639998F9">
+            <wp:extent cx="4667901" cy="4401164"/>
+            <wp:effectExtent l="0" t="0" r="0" b="0"/>
+            <wp:docPr id="73" name="Picture 73"/>
+            <wp:cNvGraphicFramePr>
+              <a:graphicFrameLocks xmlns:a="http://schemas.openxmlformats.org/drawingml/2006/main" noChangeAspect="1"/>
+            </wp:cNvGraphicFramePr>
+            <a:graphic xmlns:a="http://schemas.openxmlformats.org/drawingml/2006/main">
+              <a:graphicData uri="http://schemas.openxmlformats.org/drawingml/2006/picture">
+                <pic:pic xmlns:pic="http://schemas.openxmlformats.org/drawingml/2006/picture">
+                  <pic:nvPicPr>
+                    <pic:cNvPr id="1" name=""/>
+                    <pic:cNvPicPr/>
+                  </pic:nvPicPr>
+                  <pic:blipFill>
+                    <a:blip r:embed="rId80"/>
+                    <a:stretch>
+                      <a:fillRect/>
+                    </a:stretch>
+                  </pic:blipFill>
+                  <pic:spPr>
+                    <a:xfrm>
+                      <a:off x="0" y="0"/>
+                      <a:ext cx="4667901" cy="4401164"/>
+                    </a:xfrm>
+                    <a:prstGeom prst="rect">
+                      <a:avLst/>
+                    </a:prstGeom>
+                  </pic:spPr>
+                </pic:pic>
+              </a:graphicData>
+            </a:graphic>
+          </wp:inline>
+        </w:drawing>
+      </w:r>
+    </w:p>
+    <w:p>
+      <w:pPr>
+        <w:spacing w:before="100" w:beforeAutospacing="1" w:after="100" w:afterAutospacing="1" w:line="240" w:lineRule="auto"/>
+        <w:outlineLvl w:val="1"/>
+        <w:rPr>
+          <w:rFonts w:ascii="Times New Roman" w:eastAsia="Times New Roman" w:hAnsi="Times New Roman" w:cs="Times New Roman"/>
+          <w:b/>
+          <w:bCs/>
+          <w:sz w:val="32"/>
+          <w:szCs w:val="32"/>
+        </w:rPr>
+      </w:pPr>
+      <w:r>
+        <w:rPr>
+          <w:rFonts w:ascii="Times New Roman" w:eastAsia="Times New Roman" w:hAnsi="Times New Roman" w:cs="Times New Roman"/>
+          <w:b/>
+          <w:bCs/>
+          <w:sz w:val="32"/>
+          <w:szCs w:val="32"/>
+        </w:rPr>
+        <w:lastRenderedPageBreak/>
+        <w:drawing>
+          <wp:inline distT="0" distB="0" distL="0" distR="0" wp14:anchorId="0719BB7B" wp14:editId="013A003B">
+            <wp:extent cx="5115639" cy="3829584"/>
+            <wp:effectExtent l="0" t="0" r="8890" b="0"/>
+            <wp:docPr id="74" name="Picture 74"/>
+            <wp:cNvGraphicFramePr>
+              <a:graphicFrameLocks xmlns:a="http://schemas.openxmlformats.org/drawingml/2006/main" noChangeAspect="1"/>
+            </wp:cNvGraphicFramePr>
+            <a:graphic xmlns:a="http://schemas.openxmlformats.org/drawingml/2006/main">
+              <a:graphicData uri="http://schemas.openxmlformats.org/drawingml/2006/picture">
+                <pic:pic xmlns:pic="http://schemas.openxmlformats.org/drawingml/2006/picture">
+                  <pic:nvPicPr>
+                    <pic:cNvPr id="1" name=""/>
+                    <pic:cNvPicPr/>
+                  </pic:nvPicPr>
+                  <pic:blipFill>
+                    <a:blip r:embed="rId81"/>
+                    <a:stretch>
+                      <a:fillRect/>
+                    </a:stretch>
+                  </pic:blipFill>
+                  <pic:spPr>
+                    <a:xfrm>
+                      <a:off x="0" y="0"/>
+                      <a:ext cx="5115639" cy="3829584"/>
+                    </a:xfrm>
+                    <a:prstGeom prst="rect">
+                      <a:avLst/>
+                    </a:prstGeom>
+                  </pic:spPr>
+                </pic:pic>
+              </a:graphicData>
+            </a:graphic>
+          </wp:inline>
+        </w:drawing>
+      </w:r>
+    </w:p>
+    <w:p>
+      <w:pPr>
+        <w:spacing w:before="100" w:beforeAutospacing="1" w:after="100" w:afterAutospacing="1" w:line="240" w:lineRule="auto"/>
+        <w:outlineLvl w:val="1"/>
+        <w:rPr>
+          <w:rFonts w:ascii="Times New Roman" w:eastAsia="Times New Roman" w:hAnsi="Times New Roman" w:cs="Times New Roman"/>
+          <w:sz w:val="24"/>
+          <w:szCs w:val="24"/>
+        </w:rPr>
+      </w:pPr>
+      <w:r>
+        <w:rPr>
+          <w:rFonts w:ascii="Times New Roman" w:eastAsia="Times New Roman" w:hAnsi="Times New Roman" w:cs="Times New Roman"/>
+          <w:sz w:val="24"/>
+          <w:szCs w:val="24"/>
+        </w:rPr>
+        <w:t>Diffie-Hellman key exchange is the example of two people</w:t>
+      </w:r>
+      <w:r>
+        <w:rPr>
+          <w:rFonts w:ascii="Times New Roman" w:eastAsia="Times New Roman" w:hAnsi="Times New Roman" w:cs="Times New Roman"/>
+          <w:sz w:val="24"/>
+          <w:szCs w:val="24"/>
+        </w:rPr>
+        <w:t xml:space="preserve"> </w:t>
+      </w:r>
+      <w:proofErr w:type="spellStart"/>
+      <w:r>
+        <w:rPr>
+          <w:rFonts w:ascii="Times New Roman" w:eastAsia="Times New Roman" w:hAnsi="Times New Roman" w:cs="Times New Roman"/>
+          <w:sz w:val="24"/>
+          <w:szCs w:val="24"/>
+        </w:rPr>
+        <w:t>i.e</w:t>
+      </w:r>
+      <w:proofErr w:type="spellEnd"/>
+      <w:r>
+        <w:rPr>
+          <w:rFonts w:ascii="Times New Roman" w:eastAsia="Times New Roman" w:hAnsi="Times New Roman" w:cs="Times New Roman"/>
+          <w:sz w:val="24"/>
+          <w:szCs w:val="24"/>
+        </w:rPr>
+        <w:t xml:space="preserve"> </w:t>
+      </w:r>
+      <w:r>
+        <w:rPr>
+          <w:rFonts w:ascii="Times New Roman" w:eastAsia="Times New Roman" w:hAnsi="Times New Roman" w:cs="Times New Roman"/>
+          <w:sz w:val="24"/>
+          <w:szCs w:val="24"/>
+        </w:rPr>
+        <w:t>Alice and Bob</w:t>
+      </w:r>
+      <w:r>
+        <w:rPr>
+          <w:rFonts w:ascii="Times New Roman" w:eastAsia="Times New Roman" w:hAnsi="Times New Roman" w:cs="Times New Roman"/>
+          <w:sz w:val="24"/>
+          <w:szCs w:val="24"/>
+        </w:rPr>
+        <w:t xml:space="preserve"> </w:t>
+      </w:r>
+      <w:r>
+        <w:rPr>
+          <w:rFonts w:ascii="Times New Roman" w:eastAsia="Times New Roman" w:hAnsi="Times New Roman" w:cs="Times New Roman"/>
+          <w:sz w:val="24"/>
+          <w:szCs w:val="24"/>
+        </w:rPr>
+        <w:t xml:space="preserve">agreeing on a secret (S=2) without sending the secret. Security is based on the Discrete Logarithm Problem: If the problem is to find 'a' from </w:t>
+      </w:r>
+      <w:proofErr w:type="spellStart"/>
+      <w:r>
+        <w:rPr>
+          <w:rFonts w:ascii="Times New Roman" w:eastAsia="Times New Roman" w:hAnsi="Times New Roman" w:cs="Times New Roman"/>
+          <w:sz w:val="24"/>
+          <w:szCs w:val="24"/>
+        </w:rPr>
+        <w:t>g^a</w:t>
+      </w:r>
+      <w:proofErr w:type="spellEnd"/>
+      <w:r>
+        <w:rPr>
+          <w:rFonts w:ascii="Times New Roman" w:eastAsia="Times New Roman" w:hAnsi="Times New Roman" w:cs="Times New Roman"/>
+          <w:sz w:val="24"/>
+          <w:szCs w:val="24"/>
+        </w:rPr>
+        <w:t xml:space="preserve"> mod p, it is not easy to solve.</w:t>
+      </w:r>
+    </w:p>
+    <w:p>
+      <w:pPr>
+        <w:spacing w:before="100" w:beforeAutospacing="1" w:after="100" w:afterAutospacing="1" w:line="240" w:lineRule="auto"/>
+        <w:outlineLvl w:val="0"/>
+        <w:rPr>
+          <w:rFonts w:ascii="Times New Roman" w:eastAsia="Times New Roman" w:hAnsi="Times New Roman" w:cs="Times New Roman"/>
+          <w:b/>
+          <w:bCs/>
+          <w:kern w:val="36"/>
+          <w:sz w:val="32"/>
+          <w:szCs w:val="32"/>
+        </w:rPr>
+      </w:pPr>
+      <w:r>
+        <w:rPr>
+          <w:rFonts w:ascii="Times New Roman" w:eastAsia="Times New Roman" w:hAnsi="Times New Roman" w:cs="Times New Roman"/>
+          <w:b/>
+          <w:bCs/>
+          <w:kern w:val="36"/>
+          <w:sz w:val="32"/>
+          <w:szCs w:val="32"/>
+        </w:rPr>
+        <w:t>Assignment</w:t>
+      </w:r>
+      <w:r>
+        <w:rPr>
+          <w:rFonts w:ascii="Times New Roman" w:eastAsia="Times New Roman" w:hAnsi="Times New Roman" w:cs="Times New Roman"/>
+          <w:b/>
+          <w:bCs/>
+          <w:kern w:val="36"/>
+          <w:sz w:val="32"/>
+          <w:szCs w:val="32"/>
+        </w:rPr>
+        <w:t xml:space="preserve"> 1</w:t>
+      </w:r>
+    </w:p>
+    <w:p>
+      <w:pPr>
+        <w:spacing w:before="100" w:beforeAutospacing="1" w:after="100" w:afterAutospacing="1" w:line="240" w:lineRule="auto"/>
+        <w:outlineLvl w:val="0"/>
+        <w:rPr>
+          <w:rFonts w:ascii="Times New Roman" w:eastAsia="Times New Roman" w:hAnsi="Times New Roman" w:cs="Times New Roman"/>
+          <w:kern w:val="36"/>
+          <w:sz w:val="24"/>
+          <w:szCs w:val="24"/>
+        </w:rPr>
+      </w:pPr>
+      <w:r>
+        <w:rPr>
+          <w:rFonts w:ascii="Times New Roman" w:eastAsia="Times New Roman" w:hAnsi="Times New Roman" w:cs="Times New Roman"/>
+          <w:kern w:val="36"/>
+          <w:sz w:val="24"/>
+          <w:szCs w:val="24"/>
+        </w:rPr>
+        <w:t xml:space="preserve">In 2011 </w:t>
+      </w:r>
+      <w:proofErr w:type="spellStart"/>
+      <w:r>
+        <w:rPr>
+          <w:rFonts w:ascii="Times New Roman" w:eastAsia="Times New Roman" w:hAnsi="Times New Roman" w:cs="Times New Roman"/>
+          <w:kern w:val="36"/>
+          <w:sz w:val="24"/>
+          <w:szCs w:val="24"/>
+        </w:rPr>
+        <w:t>DigiNotar</w:t>
+      </w:r>
+      <w:proofErr w:type="spellEnd"/>
+      <w:r>
+        <w:rPr>
+          <w:rFonts w:ascii="Times New Roman" w:eastAsia="Times New Roman" w:hAnsi="Times New Roman" w:cs="Times New Roman"/>
+          <w:kern w:val="36"/>
+          <w:sz w:val="24"/>
+          <w:szCs w:val="24"/>
+        </w:rPr>
+        <w:t xml:space="preserve"> was breached, allowing 500+ fraudulent certificates to be issued, such as Google and Yahoo. The attackers used weak passwords and unpatched systems to be able to monitor 300,000 users. Browsers withdrew trust and it compelled the Dutch government to intervene. Lessons: CAs must be required to be audited, have fast disclosure mechanisms, and log in Certificate Transparency.</w:t>
+      </w:r>
+    </w:p>
+    <w:p>
+      <w:pPr>
+        <w:spacing w:before="100" w:beforeAutospacing="1" w:after="100" w:afterAutospacing="1" w:line="240" w:lineRule="auto"/>
+        <w:outlineLvl w:val="0"/>
+        <w:rPr>
+          <w:rFonts w:ascii="Times New Roman" w:eastAsia="Times New Roman" w:hAnsi="Times New Roman" w:cs="Times New Roman"/>
+          <w:b/>
+          <w:bCs/>
+          <w:kern w:val="36"/>
+          <w:sz w:val="32"/>
+          <w:szCs w:val="32"/>
+        </w:rPr>
+      </w:pPr>
+      <w:r>
+        <w:rPr>
+          <w:rFonts w:ascii="Times New Roman" w:eastAsia="Times New Roman" w:hAnsi="Times New Roman" w:cs="Times New Roman"/>
+          <w:b/>
+          <w:bCs/>
+          <w:kern w:val="36"/>
+          <w:sz w:val="32"/>
+          <w:szCs w:val="32"/>
+        </w:rPr>
+        <w:t>Assignment</w:t>
+      </w:r>
+      <w:r>
+        <w:rPr>
+          <w:rFonts w:ascii="Times New Roman" w:eastAsia="Times New Roman" w:hAnsi="Times New Roman" w:cs="Times New Roman"/>
+          <w:b/>
+          <w:bCs/>
+          <w:kern w:val="36"/>
+          <w:sz w:val="32"/>
+          <w:szCs w:val="32"/>
+        </w:rPr>
+        <w:t xml:space="preserve"> </w:t>
+      </w:r>
+      <w:r>
+        <w:rPr>
+          <w:rFonts w:ascii="Times New Roman" w:eastAsia="Times New Roman" w:hAnsi="Times New Roman" w:cs="Times New Roman"/>
+          <w:b/>
+          <w:bCs/>
+          <w:kern w:val="36"/>
+          <w:sz w:val="32"/>
+          <w:szCs w:val="32"/>
+        </w:rPr>
+        <w:t>2</w:t>
+      </w:r>
+    </w:p>
+    <w:p>
+      <w:pPr>
+        <w:spacing w:before="100" w:beforeAutospacing="1" w:after="100" w:afterAutospacing="1" w:line="240" w:lineRule="auto"/>
+        <w:outlineLvl w:val="0"/>
+        <w:rPr>
+          <w:rFonts w:ascii="Times New Roman" w:eastAsia="Times New Roman" w:hAnsi="Times New Roman" w:cs="Times New Roman"/>
+          <w:kern w:val="36"/>
+          <w:sz w:val="24"/>
+          <w:szCs w:val="24"/>
+        </w:rPr>
+      </w:pPr>
+      <w:r>
+        <w:rPr>
+          <w:rFonts w:ascii="Times New Roman" w:eastAsia="Times New Roman" w:hAnsi="Times New Roman" w:cs="Times New Roman"/>
+          <w:kern w:val="36"/>
+          <w:sz w:val="24"/>
+          <w:szCs w:val="24"/>
+        </w:rPr>
+        <w:t>Diffie-Hellman is a protocol that uses the discrete logarithm problem to allow secure key exchanges over an insecure channel. It is used in TLS/SSL, SSH and VPNs for Perfect Forward Secrecy. Authentication helps prevent MITM attacks. Efficient elliptic curve variants are provided by ECDH. There are also alternatives for post-quantum computers becoming available to counter quantum computing threats.</w:t>
+      </w:r>
+    </w:p>
+    <w:p>
+      <w:pPr>
+        <w:spacing w:before="100" w:beforeAutospacing="1" w:after="100" w:afterAutospacing="1" w:line="240" w:lineRule="auto"/>
+        <w:outlineLvl w:val="0"/>
+        <w:rPr>
+          <w:rFonts w:ascii="Times New Roman" w:eastAsia="Times New Roman" w:hAnsi="Times New Roman" w:cs="Times New Roman"/>
+          <w:kern w:val="36"/>
+          <w:sz w:val="24"/>
+          <w:szCs w:val="24"/>
+        </w:rPr>
+      </w:pPr>
+    </w:p>
+    <w:p>
+      <w:pPr>
+        <w:spacing w:before="100" w:beforeAutospacing="1" w:after="100" w:afterAutospacing="1" w:line="240" w:lineRule="auto"/>
+        <w:outlineLvl w:val="1"/>
+        <w:rPr>
+          <w:rFonts w:ascii="Times New Roman" w:eastAsia="Times New Roman" w:hAnsi="Times New Roman" w:cs="Times New Roman"/>
+          <w:sz w:val="24"/>
+          <w:szCs w:val="24"/>
+        </w:rPr>
+      </w:pPr>
+    </w:p>
+    <w:p>
+      <w:pPr>
+        <w:spacing w:before="100" w:beforeAutospacing="1" w:after="100" w:afterAutospacing="1" w:line="240" w:lineRule="auto"/>
+        <w:outlineLvl w:val="2"/>
+        <w:rPr>
+          <w:rFonts w:ascii="Times New Roman" w:eastAsia="Times New Roman" w:hAnsi="Times New Roman" w:cs="Times New Roman"/>
+          <w:sz w:val="24"/>
+          <w:szCs w:val="24"/>
+        </w:rPr>
+      </w:pPr>
+    </w:p>
+    <w:p>
+      <w:pPr>
+        <w:spacing w:before="100" w:beforeAutospacing="1" w:after="100" w:afterAutospacing="1" w:line="240" w:lineRule="auto"/>
+        <w:outlineLvl w:val="2"/>
+        <w:rPr>
+          <w:rFonts w:ascii="Times New Roman" w:eastAsia="Times New Roman" w:hAnsi="Times New Roman" w:cs="Times New Roman"/>
+          <w:sz w:val="24"/>
+          <w:szCs w:val="24"/>
+        </w:rPr>
+      </w:pPr>
+    </w:p>
+    <w:p>
+      <w:pPr>
+        <w:spacing w:before="100" w:beforeAutospacing="1" w:after="100" w:afterAutospacing="1" w:line="240" w:lineRule="auto"/>
+        <w:outlineLvl w:val="2"/>
+        <w:rPr>
+          <w:rFonts w:ascii="Times New Roman" w:eastAsia="Times New Roman" w:hAnsi="Times New Roman" w:cs="Times New Roman"/>
+          <w:sz w:val="24"/>
+          <w:szCs w:val="24"/>
+        </w:rPr>
+      </w:pPr>
+    </w:p>
+    <w:p>
+      <w:pPr>
+        <w:rPr>
+          <w:rFonts w:ascii="Times New Roman" w:hAnsi="Times New Roman" w:cs="Times New Roman"/>
+          <w:sz w:val="24"/>
+          <w:szCs w:val="24"/>
+        </w:rPr>
+      </w:pPr>
     </w:p>
     <w:p>
       <w:pPr>
@@ -9338,6 +10938,7 @@
     <w:lsdException w:name="HTML Sample" w:semiHidden="1" w:unhideWhenUsed="1"/>
     <w:lsdException w:name="HTML Typewriter" w:semiHidden="1" w:unhideWhenUsed="1"/>
     <w:lsdException w:name="HTML Variable" w:semiHidden="1" w:unhideWhenUsed="1"/>
+    <w:lsdException w:name="Normal Table" w:semiHidden="1" w:unhideWhenUsed="1"/>
     <w:lsdException w:name="annotation subject" w:semiHidden="1" w:unhideWhenUsed="1"/>
     <w:lsdException w:name="No List" w:semiHidden="1" w:unhideWhenUsed="1"/>
     <w:lsdException w:name="Outline List 1" w:semiHidden="1" w:unhideWhenUsed="1"/>
@@ -9384,8 +10985,10 @@
     <w:lsdException w:name="Table Subtle 2" w:semiHidden="1" w:unhideWhenUsed="1"/>
     <w:lsdException w:name="Table Web 1" w:semiHidden="1" w:unhideWhenUsed="1"/>
     <w:lsdException w:name="Table Web 2" w:semiHidden="1" w:unhideWhenUsed="1"/>
+    <w:lsdException w:name="Table Web 3" w:semiHidden="1" w:unhideWhenUsed="1"/>
     <w:lsdException w:name="Balloon Text" w:semiHidden="1" w:unhideWhenUsed="1"/>
     <w:lsdException w:name="Table Grid" w:uiPriority="39"/>
+    <w:lsdException w:name="Table Theme" w:semiHidden="1" w:unhideWhenUsed="1"/>
     <w:lsdException w:name="Placeholder Text" w:semiHidden="1"/>
     <w:lsdException w:name="No Spacing" w:uiPriority="1" w:qFormat="1"/>
     <w:lsdException w:name="Light Shading" w:uiPriority="60"/>
@@ -9610,7 +11213,7 @@
   <w:style w:type="paragraph" w:default="1" w:styleId="Normal">
     <w:name w:val="Normal"/>
     <w:qFormat/>
-    <w:rsid w:val="009F67AB"/>
+    <w:rsid w:val="001149B2"/>
     <w:pPr>
       <w:spacing w:line="256" w:lineRule="auto"/>
     </w:pPr>
@@ -9663,7 +11266,6 @@
   <w:style w:type="character" w:default="1" w:styleId="DefaultParagraphFont">
     <w:name w:val="Default Paragraph Font"/>
     <w:uiPriority w:val="1"/>
-    <w:semiHidden/>
     <w:unhideWhenUsed/>
   </w:style>
   <w:style w:type="table" w:default="1" w:styleId="TableNormal">

</xml_diff>